<commit_message>
Add QR code and clickable video link to CV and cover letter V2
https://claude.ai/code/session_01VUyi1CNfYssdeJRQrxit15
</commit_message>
<xml_diff>
--- a/CV_Tamou_Eljerrari_V2.docx
+++ b/CV_Tamou_Eljerrari_V2.docx
@@ -505,6 +505,83 @@
               </w:rPr>
               <w:t>Arabe — Langue maternelle</w:t>
             </w:r>
+          </w:p>
+          <w:p>
+            <w:pPr>
+              <w:spacing w:before="280" w:after="80"/>
+              <w:ind w:left="170"/>
+            </w:pPr>
+            <w:r>
+              <w:rPr>
+                <w:b/>
+                <w:color w:val="005288"/>
+                <w:sz w:val="19"/>
+              </w:rPr>
+              <w:t>VIDÉO DE PRÉSENTATION</w:t>
+            </w:r>
+          </w:p>
+          <w:p>
+            <w:pPr>
+              <w:spacing w:after="60"/>
+              <w:ind w:left="283"/>
+              <w:jc w:val="left"/>
+            </w:pPr>
+            <w:r>
+              <w:drawing>
+                <wp:inline xmlns:a="http://schemas.openxmlformats.org/drawingml/2006/main" xmlns:pic="http://schemas.openxmlformats.org/drawingml/2006/picture">
+                  <wp:extent cx="1368000" cy="1368000"/>
+                  <wp:docPr id="1" name="Picture 1"/>
+                  <wp:cNvGraphicFramePr>
+                    <a:graphicFrameLocks noChangeAspect="1"/>
+                  </wp:cNvGraphicFramePr>
+                  <a:graphic>
+                    <a:graphicData uri="http://schemas.openxmlformats.org/drawingml/2006/picture">
+                      <pic:pic>
+                        <pic:nvPicPr>
+                          <pic:cNvPr id="0" name="qrcode_video.png"/>
+                          <pic:cNvPicPr/>
+                        </pic:nvPicPr>
+                        <pic:blipFill>
+                          <a:blip r:embed="rId9"/>
+                          <a:stretch>
+                            <a:fillRect/>
+                          </a:stretch>
+                        </pic:blipFill>
+                        <pic:spPr>
+                          <a:xfrm>
+                            <a:off x="0" y="0"/>
+                            <a:ext cx="1368000" cy="1368000"/>
+                          </a:xfrm>
+                          <a:prstGeom prst="rect"/>
+                        </pic:spPr>
+                      </pic:pic>
+                    </a:graphicData>
+                  </a:graphic>
+                </wp:inline>
+              </w:drawing>
+            </w:r>
+          </w:p>
+          <w:p>
+            <w:pPr>
+              <w:spacing w:after="80"/>
+              <w:ind w:left="170"/>
+            </w:pPr>
+            <w:r>
+              <w:rPr>
+                <w:sz w:val="17"/>
+              </w:rPr>
+              <w:t xml:space="preserve">▸  </w:t>
+            </w:r>
+            <w:hyperlink r:id="rId10">
+              <w:r>
+                <w:rPr>
+                  <w:color w:val="005288"/>
+                  <w:u w:val="single"/>
+                  <w:sz w:val="20"/>
+                </w:rPr>
+                <w:t>Voir ma vidéo de présentation</w:t>
+              </w:r>
+            </w:hyperlink>
           </w:p>
         </w:tc>
         <w:tc>

</xml_diff>

<commit_message>
Add profile photo to CV V2 left column
https://claude.ai/code/session_01VUyi1CNfYssdeJRQrxit15
</commit_message>
<xml_diff>
--- a/CV_Tamou_Eljerrari_V2.docx
+++ b/CV_Tamou_Eljerrari_V2.docx
@@ -97,6 +97,46 @@
               <w:insideV w:val="none"/>
             </w:tcBorders>
           </w:tcPr>
+          <w:p>
+            <w:pPr>
+              <w:spacing w:before="280" w:after="160"/>
+              <w:jc w:val="center"/>
+            </w:pPr>
+            <w:r>
+              <w:drawing>
+                <wp:inline xmlns:a="http://schemas.openxmlformats.org/drawingml/2006/main" xmlns:pic="http://schemas.openxmlformats.org/drawingml/2006/picture">
+                  <wp:extent cx="1368000" cy="1368000"/>
+                  <wp:docPr id="2" name="Picture 2"/>
+                  <wp:cNvGraphicFramePr>
+                    <a:graphicFrameLocks noChangeAspect="1"/>
+                  </wp:cNvGraphicFramePr>
+                  <a:graphic>
+                    <a:graphicData uri="http://schemas.openxmlformats.org/drawingml/2006/picture">
+                      <pic:pic>
+                        <pic:nvPicPr>
+                          <pic:cNvPr id="0" name="photo_tamou_crop.png"/>
+                          <pic:cNvPicPr/>
+                        </pic:nvPicPr>
+                        <pic:blipFill>
+                          <a:blip r:embed="rId11"/>
+                          <a:stretch>
+                            <a:fillRect/>
+                          </a:stretch>
+                        </pic:blipFill>
+                        <pic:spPr>
+                          <a:xfrm>
+                            <a:off x="0" y="0"/>
+                            <a:ext cx="1368000" cy="1368000"/>
+                          </a:xfrm>
+                          <a:prstGeom prst="rect"/>
+                        </pic:spPr>
+                      </pic:pic>
+                    </a:graphicData>
+                  </a:graphic>
+                </wp:inline>
+              </w:drawing>
+            </w:r>
+          </w:p>
           <w:p/>
           <w:p>
             <w:pPr>

</xml_diff>